<commit_message>
Employment Agreement Rev 2026-09-28: Sec 6(A) release carve-out for gov reporting; Separation & Release template; Attachment A Sec 6.5
Co-Authored-By: Claude Opus 5.5 <noreply@anthropic.com>
</commit_message>
<xml_diff>
--- a/process-library/05-human-resources/EXOS_Attachment_A_CIIAA_Rev_2026-09-28.docx
+++ b/process-library/05-human-resources/EXOS_Attachment_A_CIIAA_Rev_2026-09-28.docx
@@ -311,6 +311,15 @@
           <w:i w:val="0"/>
         </w:rPr>
         <w:t>6.4 Handling Controlled Information While Reporting. Protected Activity does not authorize disclosure of classified information, CUI or export-controlled technical data outside authorized channels. When a report involves such information I may still make it: I will describe it generally and provide the controlled information only to an authorized recipient (for example, the relevant Inspector General or Contracting Officer) through a channel approved for that information. This Section 6 does not authorize disclosure of information protected by the Company's attorney-client privilege, except as permitted by law.</w:t>
+      </w:r>
+    </w:p>
+    <w:p>
+      <w:r>
+        <w:rPr>
+          <w:b w:val="0"/>
+          <w:i w:val="0"/>
+        </w:rPr>
+        <w:t>6.5 Separation Agreements and Releases. Section 6 applies to, and will be included in, any separation agreement, general release or other agreement the Company asks me to sign in connection with the end of my employment, including the release required for termination benefits under Section 6(A) of the Employment Agreement. No such release will waive my right to receive an award from a government agency for information provided, and any "non-disclosure" term in it is subject to Sections 6 and 7.</w:t>
       </w:r>
     </w:p>
     <w:p>

</xml_diff>